<commit_message>
Diligence questions: rent 50/50 change + $813K loan-to-Microcosm netting
</commit_message>
<xml_diff>
--- a/drafts/SSLC_Related_Party_Diligence_Questions_2026-10-12.docx
+++ b/drafts/SSLC_Related_Party_Diligence_Questions_2026-10-12.docx
@@ -472,7 +472,17 @@
     </w:p>
     <w:p>
       <w:r>
-        <w:t>10. Please confirm that no related-party debt will be repaid, prepaid or secured before close without disinterested-director approval.</w:t>
+        <w:t>11. Rent split: from January to June 2024 SSLC paid Microcosm $11,470/month, about 50% of the $23,647 facility rent. From July 2024 SSLC paid 100% ($23,647/month, then $24,238 in 2025, then $24,844 paid directly to the landlords in 2026). What changed in July 2024, who approved it, and why is Microcosm's ~50% share (~$316K, July 2024–August 2026, rent only) not credited against the $451,429 Due to Microcosm?</w:t>
+      </w:r>
+    </w:p>
+    <w:p>
+      <w:r>
+        <w:t>12. Loan to Microcosm (1481): SSLC's books show SSLC lent Microcosm $812,699 between 2019 and October 2025 (booked 4/30/2026), then netted it entirely on 4/30/2026 against Microcosm balances ($294,499 Loan Payable–Microcosm; $423,965 pre-6/2025 reimbursables; $61,290 "Judy's time"; $32,946 reimbursable). Please provide the invoices supporting each offset balance, and confirm why $451,429 remains due to Microcosm after SSLC's $812,699 of loans.</w:t>
+      </w:r>
+    </w:p>
+    <w:p>
+      <w:r>
+        <w:t>13. Please confirm that no related-party debt will be repaid, prepaid or secured before close without disinterested-director approval.</w:t>
       </w:r>
     </w:p>
     <w:p>

</xml_diff>

<commit_message>
SSLC batch 6: K 1480-account disclosure + Step 3 + Q14
Slide 5:
- $812,699: rewritten — Workman's Comp acct (1480), not shown as
  receivable; netted 6/30/2025 (JEs #25925/#25926); reclassified
  4/30/2026 to 1481 which now shows $0
- Right panel Exos bullet: adds Microcosm 2026 repayment contrast
  (Microcosm repaid $154K within months; Exos $31K past due)
- Step 3 added: full $812K undocumented => $1.26M; non-Wertz ~$585K;
  Conger ~$129K; Rufer ~$160K

Slide 6:
- Impact band Step 3: Per 1% -$15.4K; Conger -$128.7K

Diligence DOCX+PDF:
- Q14 added: 1480 account rationale, 2019-23 transfers, JE approvals

Rebuild: 16pp deck, 24pp package
MC #2414 v24/v19/v14 + diligence v1
</commit_message>
<xml_diff>
--- a/drafts/SSLC_Related_Party_Diligence_Questions_2026-10-12.docx
+++ b/drafts/SSLC_Related_Party_Diligence_Questions_2026-10-12.docx
@@ -472,7 +472,10 @@
     </w:p>
     <w:p>
       <w:r>
-        <w:t>11. Rent split: from January to June 2024 SSLC paid Microcosm $11,470/month, about 50% of the $23,647 facility rent. From July 2024 SSLC paid 100% ($23,647/month, then $24,238 in 2025, then $24,844 paid directly to the landlords in 2026). What changed in July 2024, who approved it, and why is Microcosm's ~50% share (~$316K, July 2024–August 2026, rent only) not credited against the $451,429 Due to Microcosm?</w:t>
+        <w:t>11. Rent split: from January to June 2024 SSLC paid Microcosm $11,470/month, about 50% of the $23,647 facility rent. From July 2024 SSLC paid 100% ($23,647/month, then $24,238 in 2025, then $24,844 paid directly to the landlords in 2026). What changed in July 2024, who approved it, and why is Microcosm's ~50% share (~$316K of rent plus ~$35K of utilities, July 2024–August 2026) not credited against the $451,429 Due to Microcosm?</w:t>
+      </w:r>
+      <w:r>
+        <w:t xml:space="preserve"> Utilities show the same pattern: about $1,059/month in January–June 2024, then about $2,727/month from July 2024.</w:t>
       </w:r>
     </w:p>
     <w:p>
@@ -483,6 +486,11 @@
     <w:p>
       <w:r>
         <w:t>13. Please confirm that no related-party debt will be repaid, prepaid or secured before close without disinterested-director approval.</w:t>
+      </w:r>
+    </w:p>
+    <w:p>
+      <w:r>
+        <w:t xml:space="preserve">14. Why were SSLC’s loans to Microcosm recorded in 1480 Workman’s Comp Over/Under rather than a receivable? Please provide the 2019–2023 transfers, the support for the pre-2024 $294,499 Loan Payable–Microcosm, and the approvals for JEs #25925/#25926 (6/30/2025) and the 2026 Microcosm loans and repayments.</w:t>
       </w:r>
     </w:p>
     <w:p>

</xml_diff>